<commit_message>
feat: mise à jour complète — backend, frontend, export, tests
</commit_message>
<xml_diff>
--- a/templates/BACK UP M.docx
+++ b/templates/BACK UP M.docx
@@ -105,7 +105,7 @@
           <w:iCs/>
           <w:sz w:val="20"/>
         </w:rPr>
-        <w:t>EL OBIDI MOHAMMED</w:t>
+        <w:t>{{PATIENT_NAME}}</w:t>
       </w:r>
       <w:r>
         <w:rPr>
@@ -154,7 +154,7 @@
           <w:smallCaps/>
           <w:sz w:val="20"/>
         </w:rPr>
-        <w:t>Masculin</w:t>
+        <w:t>{{SEX}}</w:t>
       </w:r>
     </w:p>
     <w:p>
@@ -199,7 +199,7 @@
           <w:iCs/>
           <w:sz w:val="20"/>
         </w:rPr>
-        <w:t>2126</w:t>
+        <w:t>{{IPP}}</w:t>
       </w:r>
       <w:r>
         <w:rPr>
@@ -294,7 +294,7 @@
           <w:iCs/>
           <w:sz w:val="20"/>
         </w:rPr>
-        <w:t>14/04/2026</w:t>
+        <w:t>{{EXAM_DATE}}</w:t>
       </w:r>
       <w:r>
         <w:rPr>
@@ -404,7 +404,7 @@
         <w:rPr>
           <w:sz w:val="20"/>
         </w:rPr>
-        <w:t>Dr NAJLAA BELHARTY, Dr HAJJAJ BELGHAIT, Dr EL MEHDI EL HADDIOUI, Dr IDRISS ALLALAT, Dr MEHDI AYOUB LAAROUSSI</w:t>
+        <w:t>{{OPERATORS}}</w:t>
       </w:r>
     </w:p>
     <w:p>
@@ -454,7 +454,7 @@
           <w:b/>
           <w:sz w:val="20"/>
         </w:rPr>
-        <w:t xml:space="preserve"> STEMI LIKE </w:t>
+        <w:t xml:space="preserve"> {{INDICATION}}</w:t>
       </w:r>
     </w:p>
     <w:p>
@@ -533,7 +533,7 @@
           <w:sz w:val="20"/>
           <w:szCs w:val="20"/>
         </w:rPr>
-        <w:t> 73</w:t>
+        <w:t xml:space="preserve"> {{AGE}}</w:t>
       </w:r>
     </w:p>
     <w:p>
@@ -583,7 +583,7 @@
           <w:sz w:val="20"/>
           <w:szCs w:val="20"/>
         </w:rPr>
-        <w:t xml:space="preserve">: HTA mal </w:t>
+        <w:t>: {{FDRCX}}</w:t>
       </w:r>
       <w:proofErr w:type="spellStart"/>
       <w:r>
@@ -593,7 +593,6 @@
           <w:sz w:val="20"/>
           <w:szCs w:val="20"/>
         </w:rPr>
-        <w:t>equilibrée</w:t>
       </w:r>
       <w:proofErr w:type="spellEnd"/>
       <w:r>
@@ -603,7 +602,6 @@
           <w:sz w:val="20"/>
           <w:szCs w:val="20"/>
         </w:rPr>
-        <w:t xml:space="preserve"> sous </w:t>
       </w:r>
       <w:proofErr w:type="gramStart"/>
       <w:r>
@@ -613,7 +611,6 @@
           <w:sz w:val="20"/>
           <w:szCs w:val="20"/>
         </w:rPr>
-        <w:t>Amlodipine ,</w:t>
       </w:r>
       <w:proofErr w:type="gramEnd"/>
       <w:r>
@@ -623,7 +620,6 @@
           <w:sz w:val="20"/>
           <w:szCs w:val="20"/>
         </w:rPr>
-        <w:t xml:space="preserve"> DT2 mal </w:t>
       </w:r>
       <w:proofErr w:type="spellStart"/>
       <w:r>
@@ -633,7 +629,6 @@
           <w:sz w:val="20"/>
           <w:szCs w:val="20"/>
         </w:rPr>
-        <w:t>equilibré</w:t>
       </w:r>
       <w:proofErr w:type="spellEnd"/>
       <w:r>
@@ -643,7 +638,6 @@
           <w:sz w:val="20"/>
           <w:szCs w:val="20"/>
         </w:rPr>
-        <w:t xml:space="preserve"> ( </w:t>
       </w:r>
       <w:proofErr w:type="spellStart"/>
       <w:r>
@@ -653,7 +647,6 @@
           <w:sz w:val="20"/>
           <w:szCs w:val="20"/>
         </w:rPr>
-        <w:t>derniere</w:t>
       </w:r>
       <w:proofErr w:type="spellEnd"/>
       <w:r>
@@ -663,7 +656,6 @@
           <w:sz w:val="20"/>
           <w:szCs w:val="20"/>
         </w:rPr>
-        <w:t xml:space="preserve"> hba1c 8,5 % ) , tabagisme sevré </w:t>
       </w:r>
     </w:p>
     <w:p>
@@ -700,7 +692,7 @@
           <w:sz w:val="20"/>
           <w:szCs w:val="20"/>
         </w:rPr>
-        <w:t xml:space="preserve">: - </w:t>
+        <w:t>: {{ATCD}}</w:t>
       </w:r>
     </w:p>
     <w:p>
@@ -737,25 +729,23 @@
           <w:sz w:val="20"/>
           <w:szCs w:val="20"/>
         </w:rPr>
-        <w:t>: R</w:t>
-      </w:r>
-      <w:r>
-        <w:rPr>
-          <w:rFonts w:ascii="Calibri" w:hAnsi="Calibri" w:cs="Calibri"/>
-          <w:color w:val="000000"/>
-          <w:sz w:val="20"/>
-          <w:szCs w:val="20"/>
-        </w:rPr>
-        <w:t xml:space="preserve">emonte </w:t>
-      </w:r>
-      <w:r>
-        <w:rPr>
-          <w:rFonts w:ascii="Calibri" w:hAnsi="Calibri" w:cs="Calibri"/>
-          <w:color w:val="000000"/>
-          <w:sz w:val="20"/>
-          <w:szCs w:val="20"/>
-        </w:rPr>
-        <w:t>au jour de son admission à 17h00 par l’installation d’</w:t>
+        <w:t>: {{HM}}</w:t>
+      </w:r>
+      <w:r>
+        <w:rPr>
+          <w:rFonts w:ascii="Calibri" w:hAnsi="Calibri" w:cs="Calibri"/>
+          <w:color w:val="000000"/>
+          <w:sz w:val="20"/>
+          <w:szCs w:val="20"/>
+        </w:rPr>
+      </w:r>
+      <w:r>
+        <w:rPr>
+          <w:rFonts w:ascii="Calibri" w:hAnsi="Calibri" w:cs="Calibri"/>
+          <w:color w:val="000000"/>
+          <w:sz w:val="20"/>
+          <w:szCs w:val="20"/>
+        </w:rPr>
       </w:r>
       <w:proofErr w:type="spellStart"/>
       <w:r>
@@ -765,7 +755,6 @@
           <w:sz w:val="20"/>
           <w:szCs w:val="20"/>
         </w:rPr>
-        <w:t>epigastralgies</w:t>
       </w:r>
       <w:proofErr w:type="spellEnd"/>
       <w:r>
@@ -775,7 +764,6 @@
           <w:sz w:val="20"/>
           <w:szCs w:val="20"/>
         </w:rPr>
-        <w:t xml:space="preserve"> prolongées avec signe </w:t>
       </w:r>
       <w:proofErr w:type="spellStart"/>
       <w:r>
@@ -785,7 +773,6 @@
           <w:sz w:val="20"/>
           <w:szCs w:val="20"/>
         </w:rPr>
-        <w:t>neurovegetatifs</w:t>
       </w:r>
       <w:proofErr w:type="spellEnd"/>
       <w:r>
@@ -795,7 +782,6 @@
           <w:sz w:val="20"/>
           <w:szCs w:val="20"/>
         </w:rPr>
-        <w:t xml:space="preserve"> motivant sa </w:t>
       </w:r>
       <w:proofErr w:type="spellStart"/>
       <w:r>
@@ -805,7 +791,6 @@
           <w:sz w:val="20"/>
           <w:szCs w:val="20"/>
         </w:rPr>
-        <w:t>consulation</w:t>
       </w:r>
       <w:proofErr w:type="spellEnd"/>
       <w:r>
@@ -815,7 +800,6 @@
           <w:sz w:val="20"/>
           <w:szCs w:val="20"/>
         </w:rPr>
-        <w:t xml:space="preserve"> à l’</w:t>
       </w:r>
       <w:proofErr w:type="spellStart"/>
       <w:r>
@@ -825,7 +809,6 @@
           <w:sz w:val="20"/>
           <w:szCs w:val="20"/>
         </w:rPr>
-        <w:t>Hopital</w:t>
       </w:r>
       <w:proofErr w:type="spellEnd"/>
       <w:r>
@@ -835,7 +818,6 @@
           <w:sz w:val="20"/>
           <w:szCs w:val="20"/>
         </w:rPr>
-        <w:t xml:space="preserve"> </w:t>
       </w:r>
       <w:proofErr w:type="spellStart"/>
       <w:r>
@@ -845,7 +827,6 @@
           <w:sz w:val="20"/>
           <w:szCs w:val="20"/>
         </w:rPr>
-        <w:t>My</w:t>
       </w:r>
       <w:proofErr w:type="spellEnd"/>
       <w:r>
@@ -855,7 +836,6 @@
           <w:sz w:val="20"/>
           <w:szCs w:val="20"/>
         </w:rPr>
-        <w:t xml:space="preserve"> Youssef à H1 puis au transfert dans notre structure </w:t>
       </w:r>
       <w:proofErr w:type="gramStart"/>
       <w:r>
@@ -865,7 +845,6 @@
           <w:sz w:val="20"/>
           <w:szCs w:val="20"/>
         </w:rPr>
-        <w:t xml:space="preserve">pour  </w:t>
       </w:r>
       <w:proofErr w:type="spellStart"/>
       <w:r>
@@ -875,7 +854,6 @@
           <w:sz w:val="20"/>
           <w:szCs w:val="20"/>
         </w:rPr>
-        <w:t>complement</w:t>
       </w:r>
       <w:proofErr w:type="spellEnd"/>
       <w:proofErr w:type="gramEnd"/>
@@ -886,7 +864,6 @@
           <w:sz w:val="20"/>
           <w:szCs w:val="20"/>
         </w:rPr>
-        <w:t xml:space="preserve"> de prise en charge .</w:t>
       </w:r>
     </w:p>
     <w:p>
@@ -923,7 +900,7 @@
           <w:sz w:val="20"/>
           <w:szCs w:val="20"/>
         </w:rPr>
-        <w:t xml:space="preserve">: RRS, Sus </w:t>
+        <w:t xml:space="preserve"> : {{ECG}}</w:t>
       </w:r>
       <w:proofErr w:type="spellStart"/>
       <w:r>
@@ -933,7 +910,6 @@
           <w:sz w:val="20"/>
           <w:szCs w:val="20"/>
         </w:rPr>
-        <w:t>decalage</w:t>
       </w:r>
       <w:proofErr w:type="spellEnd"/>
       <w:r>
@@ -943,7 +919,6 @@
           <w:sz w:val="20"/>
           <w:szCs w:val="20"/>
         </w:rPr>
-        <w:t xml:space="preserve"> en </w:t>
       </w:r>
       <w:proofErr w:type="spellStart"/>
       <w:proofErr w:type="gramStart"/>
@@ -954,7 +929,6 @@
           <w:sz w:val="20"/>
           <w:szCs w:val="20"/>
         </w:rPr>
-        <w:t>AVr</w:t>
       </w:r>
       <w:proofErr w:type="spellEnd"/>
       <w:r>
@@ -964,7 +938,6 @@
           <w:sz w:val="20"/>
           <w:szCs w:val="20"/>
         </w:rPr>
-        <w:t xml:space="preserve"> ,</w:t>
       </w:r>
       <w:proofErr w:type="gramEnd"/>
       <w:r>
@@ -974,7 +947,6 @@
           <w:sz w:val="20"/>
           <w:szCs w:val="20"/>
         </w:rPr>
-        <w:t xml:space="preserve"> sous </w:t>
       </w:r>
       <w:proofErr w:type="spellStart"/>
       <w:r>
@@ -984,7 +956,6 @@
           <w:sz w:val="20"/>
           <w:szCs w:val="20"/>
         </w:rPr>
-        <w:t>decalage</w:t>
       </w:r>
       <w:proofErr w:type="spellEnd"/>
       <w:r>
@@ -994,7 +965,6 @@
           <w:sz w:val="20"/>
           <w:szCs w:val="20"/>
         </w:rPr>
-        <w:t xml:space="preserve"> diffus.</w:t>
       </w:r>
     </w:p>
     <w:p>
@@ -1032,7 +1002,7 @@
           <w:sz w:val="20"/>
           <w:szCs w:val="20"/>
         </w:rPr>
-        <w:t>VG non dilaté, non hypertrophié, de bonne cinétique, FEVG 55%</w:t>
+        <w:t xml:space="preserve"> {{ETT}}</w:t>
       </w:r>
     </w:p>
     <w:p>
@@ -1097,7 +1067,7 @@
           <w:sz w:val="20"/>
           <w:szCs w:val="20"/>
         </w:rPr>
-        <w:t xml:space="preserve">GE innova. </w:t>
+        <w:t xml:space="preserve">{{ROOM}}. </w:t>
       </w:r>
       <w:r>
         <w:rPr>
@@ -1153,7 +1123,7 @@
           <w:sz w:val="20"/>
           <w:szCs w:val="20"/>
         </w:rPr>
-        <w:t xml:space="preserve">Artère fémorale droite - 5 French. – </w:t>
+        <w:t xml:space="preserve">{{APPROACH}} - {{FRENCH}} French.  </w:t>
       </w:r>
       <w:r>
         <w:rPr>
@@ -1168,7 +1138,7 @@
           <w:sz w:val="20"/>
           <w:szCs w:val="20"/>
         </w:rPr>
-        <w:t xml:space="preserve">120 cc – </w:t>
+        <w:t xml:space="preserve">{{PDC}} cc  </w:t>
       </w:r>
       <w:r>
         <w:rPr>
@@ -1183,7 +1153,7 @@
           <w:sz w:val="20"/>
           <w:szCs w:val="20"/>
         </w:rPr>
-        <w:t>: 285 mGy</w:t>
+        <w:t>: {{DOSE}} mGy</w:t>
       </w:r>
       <w:r>
         <w:rPr>
@@ -1243,7 +1213,7 @@
           <w:sz w:val="20"/>
           <w:szCs w:val="20"/>
         </w:rPr>
-        <w:t xml:space="preserve"> 0.035 (ABBOTT LABORATORIES). </w:t>
+        <w:t>{{MATERIAL}}</w:t>
       </w:r>
     </w:p>
     <w:p>
@@ -1263,7 +1233,6 @@
           <w:sz w:val="20"/>
           <w:szCs w:val="20"/>
         </w:rPr>
-        <w:t xml:space="preserve"> FR 4 (Boston Scientific). </w:t>
       </w:r>
     </w:p>
     <w:p>
@@ -1283,7 +1252,6 @@
           <w:sz w:val="20"/>
           <w:szCs w:val="20"/>
         </w:rPr>
-        <w:t xml:space="preserve"> IMPULSE 5F JL 3.5 (Boston Scientific). </w:t>
       </w:r>
     </w:p>
     <w:p>
@@ -1303,7 +1271,6 @@
           <w:sz w:val="20"/>
           <w:szCs w:val="20"/>
         </w:rPr>
-        <w:t xml:space="preserve"> </w:t>
       </w:r>
       <w:proofErr w:type="spellStart"/>
       <w:r>
@@ -1311,7 +1278,6 @@
           <w:sz w:val="20"/>
           <w:szCs w:val="20"/>
         </w:rPr>
-        <w:t>Introducer</w:t>
       </w:r>
       <w:proofErr w:type="spellEnd"/>
       <w:r>
@@ -1319,7 +1285,6 @@
           <w:sz w:val="20"/>
           <w:szCs w:val="20"/>
         </w:rPr>
-        <w:t xml:space="preserve"> Fémoral 6F (Terumo). </w:t>
       </w:r>
     </w:p>
     <w:p>
@@ -1387,7 +1352,7 @@
           <w:sz w:val="20"/>
           <w:szCs w:val="20"/>
         </w:rPr>
-        <w:t xml:space="preserve">Dominance droite. </w:t>
+        <w:t xml:space="preserve">{{DOMINANCE}}. </w:t>
       </w:r>
     </w:p>
     <w:p>
@@ -1486,7 +1451,7 @@
           <w:sz w:val="20"/>
           <w:szCs w:val="20"/>
         </w:rPr>
-        <w:t xml:space="preserve">Le tronc commun se connecte au sinus antéro-gauche, il est de </w:t>
+        <w:t>{{CORO_TCG}}</w:t>
       </w:r>
       <w:proofErr w:type="gramStart"/>
       <w:r>
@@ -1496,7 +1461,6 @@
           <w:sz w:val="20"/>
           <w:szCs w:val="20"/>
         </w:rPr>
-        <w:t>court  et</w:t>
       </w:r>
       <w:proofErr w:type="gramEnd"/>
       <w:r>
@@ -1506,7 +1470,6 @@
           <w:sz w:val="20"/>
           <w:szCs w:val="20"/>
         </w:rPr>
-        <w:t xml:space="preserve"> de calibre normal. Il se bifurque en réseau IVA – diagonale et réseau CX-</w:t>
       </w:r>
       <w:proofErr w:type="gramStart"/>
       <w:r>
@@ -1516,7 +1479,6 @@
           <w:sz w:val="20"/>
           <w:szCs w:val="20"/>
         </w:rPr>
-        <w:t>marginale .</w:t>
       </w:r>
       <w:proofErr w:type="gramEnd"/>
       <w:r>
@@ -1526,7 +1488,6 @@
           <w:sz w:val="20"/>
           <w:szCs w:val="20"/>
         </w:rPr>
-        <w:t xml:space="preserve">  </w:t>
       </w:r>
       <w:proofErr w:type="gramStart"/>
       <w:r>
@@ -1536,7 +1497,6 @@
           <w:sz w:val="20"/>
           <w:szCs w:val="20"/>
         </w:rPr>
-        <w:t>il</w:t>
       </w:r>
       <w:proofErr w:type="gramEnd"/>
       <w:r>
@@ -1546,7 +1506,6 @@
           <w:sz w:val="20"/>
           <w:szCs w:val="20"/>
         </w:rPr>
-        <w:t xml:space="preserve"> présente une lésion significative serrée ( 50- 70 %) avec un flux coronaire antérograde TIMI III .</w:t>
       </w:r>
     </w:p>
     <w:p>
@@ -1571,7 +1530,7 @@
           <w:szCs w:val="20"/>
           <w:lang w:eastAsia="fr-FR"/>
         </w:rPr>
-        <w:t xml:space="preserve">L'artère interventriculaire antérieure est de calibre normal, elle fait la pointe du </w:t>
+        <w:t>{{CORO_IVA}}</w:t>
       </w:r>
       <w:proofErr w:type="gramStart"/>
       <w:r>
@@ -1582,17 +1541,15 @@
           <w:szCs w:val="20"/>
           <w:lang w:eastAsia="fr-FR"/>
         </w:rPr>
-        <w:t xml:space="preserve">cœur </w:t>
-      </w:r>
-      <w:r>
-        <w:rPr>
-          <w:rFonts w:eastAsia="Times New Roman" w:cs="Calibri"/>
-          <w:color w:val="000000"/>
-          <w:sz w:val="20"/>
-          <w:szCs w:val="20"/>
-          <w:lang w:eastAsia="fr-FR"/>
-        </w:rPr>
-        <w:t>.elle</w:t>
+      </w:r>
+      <w:r>
+        <w:rPr>
+          <w:rFonts w:eastAsia="Times New Roman" w:cs="Calibri"/>
+          <w:color w:val="000000"/>
+          <w:sz w:val="20"/>
+          <w:szCs w:val="20"/>
+          <w:lang w:eastAsia="fr-FR"/>
+        </w:rPr>
       </w:r>
       <w:proofErr w:type="gramEnd"/>
       <w:r>
@@ -1603,17 +1560,15 @@
           <w:szCs w:val="20"/>
           <w:lang w:eastAsia="fr-FR"/>
         </w:rPr>
-        <w:t xml:space="preserve"> présente une infiltration athéromateuse sur toute sa longueur et est calcifiée dans sa partie proximale . Elle </w:t>
-      </w:r>
-      <w:r>
-        <w:rPr>
-          <w:rFonts w:eastAsia="Times New Roman" w:cs="Calibri"/>
-          <w:color w:val="000000"/>
-          <w:sz w:val="20"/>
-          <w:szCs w:val="20"/>
-          <w:lang w:eastAsia="fr-FR"/>
-        </w:rPr>
-        <w:t xml:space="preserve">donne naissance à </w:t>
+      </w:r>
+      <w:r>
+        <w:rPr>
+          <w:rFonts w:eastAsia="Times New Roman" w:cs="Calibri"/>
+          <w:color w:val="000000"/>
+          <w:sz w:val="20"/>
+          <w:szCs w:val="20"/>
+          <w:lang w:eastAsia="fr-FR"/>
+        </w:rPr>
       </w:r>
       <w:proofErr w:type="gramStart"/>
       <w:r>
@@ -1624,7 +1579,6 @@
           <w:szCs w:val="20"/>
           <w:lang w:eastAsia="fr-FR"/>
         </w:rPr>
-        <w:t>deux  branche</w:t>
       </w:r>
       <w:proofErr w:type="gramEnd"/>
       <w:r>
@@ -1635,7 +1589,6 @@
           <w:szCs w:val="20"/>
           <w:lang w:eastAsia="fr-FR"/>
         </w:rPr>
-        <w:t xml:space="preserve"> diagonales et quelques branches septales . </w:t>
       </w:r>
       <w:proofErr w:type="gramStart"/>
       <w:r>
@@ -1646,7 +1599,6 @@
           <w:szCs w:val="20"/>
           <w:lang w:eastAsia="fr-FR"/>
         </w:rPr>
-        <w:t>l’IVA</w:t>
       </w:r>
       <w:proofErr w:type="gramEnd"/>
       <w:r>
@@ -1657,17 +1609,15 @@
           <w:szCs w:val="20"/>
           <w:lang w:eastAsia="fr-FR"/>
         </w:rPr>
-        <w:t xml:space="preserve"> proximo moyenne présente une lésion serrée ( 50-70% ).</w:t>
-      </w:r>
-      <w:r>
-        <w:rPr>
-          <w:rFonts w:eastAsia="Times New Roman" w:cs="Calibri"/>
-          <w:color w:val="000000"/>
-          <w:sz w:val="20"/>
-          <w:szCs w:val="20"/>
-          <w:lang w:eastAsia="fr-FR"/>
-        </w:rPr>
-        <w:t xml:space="preserve"> </w:t>
+      </w:r>
+      <w:r>
+        <w:rPr>
+          <w:rFonts w:eastAsia="Times New Roman" w:cs="Calibri"/>
+          <w:color w:val="000000"/>
+          <w:sz w:val="20"/>
+          <w:szCs w:val="20"/>
+          <w:lang w:eastAsia="fr-FR"/>
+        </w:rPr>
       </w:r>
       <w:proofErr w:type="gramStart"/>
       <w:r>
@@ -1678,7 +1628,6 @@
           <w:szCs w:val="20"/>
           <w:lang w:eastAsia="fr-FR"/>
         </w:rPr>
-        <w:t>L’IVA  distale</w:t>
       </w:r>
       <w:proofErr w:type="gramEnd"/>
       <w:r>
@@ -1689,7 +1638,6 @@
           <w:szCs w:val="20"/>
           <w:lang w:eastAsia="fr-FR"/>
         </w:rPr>
-        <w:t xml:space="preserve"> est le siège d’une lésion serrée ( 70 % ) . </w:t>
       </w:r>
       <w:proofErr w:type="gramStart"/>
       <w:r>
@@ -1700,7 +1648,6 @@
           <w:szCs w:val="20"/>
           <w:lang w:eastAsia="fr-FR"/>
         </w:rPr>
-        <w:t>le</w:t>
       </w:r>
       <w:proofErr w:type="gramEnd"/>
       <w:r>
@@ -1711,7 +1658,6 @@
           <w:szCs w:val="20"/>
           <w:lang w:eastAsia="fr-FR"/>
         </w:rPr>
-        <w:t xml:space="preserve"> flux coronaire antérograde est TIMI III avec  un bon lit d’aval.</w:t>
       </w:r>
     </w:p>
     <w:p>
@@ -1738,17 +1684,16 @@
           <w:szCs w:val="20"/>
           <w:lang w:eastAsia="fr-FR"/>
         </w:rPr>
-        <w:t>L'artère circonflexe est de calibre normal</w:t>
-      </w:r>
-      <w:r>
-        <w:rPr>
-          <w:rFonts w:eastAsia="Times New Roman" w:cs="Calibri"/>
-          <w:color w:val="000000"/>
-          <w:sz w:val="20"/>
-          <w:szCs w:val="20"/>
-          <w:lang w:eastAsia="fr-FR"/>
-        </w:rPr>
-        <w:t xml:space="preserve">, infiltrée sur sa </w:t>
+        <w:t>{{CORO_CX}}</w:t>
+      </w:r>
+      <w:r>
+        <w:rPr>
+          <w:rFonts w:eastAsia="Times New Roman" w:cs="Calibri"/>
+          <w:color w:val="000000"/>
+          <w:sz w:val="20"/>
+          <w:szCs w:val="20"/>
+          <w:lang w:eastAsia="fr-FR"/>
+        </w:rPr>
       </w:r>
       <w:proofErr w:type="gramStart"/>
       <w:r>
@@ -1759,7 +1704,6 @@
           <w:szCs w:val="20"/>
           <w:lang w:eastAsia="fr-FR"/>
         </w:rPr>
-        <w:t>longueur ,</w:t>
       </w:r>
       <w:proofErr w:type="gramEnd"/>
       <w:r>
@@ -1770,27 +1714,24 @@
           <w:szCs w:val="20"/>
           <w:lang w:eastAsia="fr-FR"/>
         </w:rPr>
-        <w:t xml:space="preserve"> et</w:t>
-      </w:r>
-      <w:r>
-        <w:rPr>
-          <w:rFonts w:eastAsia="Times New Roman" w:cs="Calibri"/>
-          <w:color w:val="000000"/>
-          <w:sz w:val="20"/>
-          <w:szCs w:val="20"/>
-          <w:lang w:eastAsia="fr-FR"/>
-        </w:rPr>
-        <w:t xml:space="preserve"> donne naissa</w:t>
-      </w:r>
-      <w:r>
-        <w:rPr>
-          <w:rFonts w:eastAsia="Times New Roman" w:cs="Calibri"/>
-          <w:color w:val="000000"/>
-          <w:sz w:val="20"/>
-          <w:szCs w:val="20"/>
-          <w:lang w:eastAsia="fr-FR"/>
-        </w:rPr>
-        <w:t xml:space="preserve">nce à une  branche marginale principale, qui se bifurque en deux collatérales . Elle présente à son ostium une plaque </w:t>
+      </w:r>
+      <w:r>
+        <w:rPr>
+          <w:rFonts w:eastAsia="Times New Roman" w:cs="Calibri"/>
+          <w:color w:val="000000"/>
+          <w:sz w:val="20"/>
+          <w:szCs w:val="20"/>
+          <w:lang w:eastAsia="fr-FR"/>
+        </w:rPr>
+      </w:r>
+      <w:r>
+        <w:rPr>
+          <w:rFonts w:eastAsia="Times New Roman" w:cs="Calibri"/>
+          <w:color w:val="000000"/>
+          <w:sz w:val="20"/>
+          <w:szCs w:val="20"/>
+          <w:lang w:eastAsia="fr-FR"/>
+        </w:rPr>
       </w:r>
       <w:proofErr w:type="spellStart"/>
       <w:r>
@@ -1801,7 +1742,6 @@
           <w:szCs w:val="20"/>
           <w:lang w:eastAsia="fr-FR"/>
         </w:rPr>
-        <w:t>intermediaire</w:t>
       </w:r>
       <w:proofErr w:type="spellEnd"/>
       <w:r>
@@ -1812,7 +1752,6 @@
           <w:szCs w:val="20"/>
           <w:lang w:eastAsia="fr-FR"/>
         </w:rPr>
-        <w:t xml:space="preserve"> </w:t>
       </w:r>
       <w:proofErr w:type="gramStart"/>
       <w:r>
@@ -1823,7 +1762,6 @@
           <w:szCs w:val="20"/>
           <w:lang w:eastAsia="fr-FR"/>
         </w:rPr>
-        <w:t>( 50</w:t>
       </w:r>
       <w:proofErr w:type="gramEnd"/>
       <w:r>
@@ -1834,17 +1772,15 @@
           <w:szCs w:val="20"/>
           <w:lang w:eastAsia="fr-FR"/>
         </w:rPr>
-        <w:t xml:space="preserve"> % ) . </w:t>
-      </w:r>
-      <w:r>
-        <w:rPr>
-          <w:rFonts w:eastAsia="Times New Roman" w:cs="Calibri"/>
-          <w:color w:val="000000"/>
-          <w:sz w:val="20"/>
-          <w:szCs w:val="20"/>
-          <w:lang w:eastAsia="fr-FR"/>
-        </w:rPr>
-        <w:t xml:space="preserve">La Cx </w:t>
+      </w:r>
+      <w:r>
+        <w:rPr>
+          <w:rFonts w:eastAsia="Times New Roman" w:cs="Calibri"/>
+          <w:color w:val="000000"/>
+          <w:sz w:val="20"/>
+          <w:szCs w:val="20"/>
+          <w:lang w:eastAsia="fr-FR"/>
+        </w:rPr>
       </w:r>
       <w:proofErr w:type="gramStart"/>
       <w:r>
@@ -1855,17 +1791,15 @@
           <w:szCs w:val="20"/>
           <w:lang w:eastAsia="fr-FR"/>
         </w:rPr>
-        <w:t xml:space="preserve">distale </w:t>
-      </w:r>
-      <w:r>
-        <w:rPr>
-          <w:rFonts w:eastAsia="Times New Roman" w:cs="Calibri"/>
-          <w:color w:val="000000"/>
-          <w:sz w:val="20"/>
-          <w:szCs w:val="20"/>
-          <w:lang w:eastAsia="fr-FR"/>
-        </w:rPr>
-        <w:t xml:space="preserve"> est</w:t>
+      </w:r>
+      <w:r>
+        <w:rPr>
+          <w:rFonts w:eastAsia="Times New Roman" w:cs="Calibri"/>
+          <w:color w:val="000000"/>
+          <w:sz w:val="20"/>
+          <w:szCs w:val="20"/>
+          <w:lang w:eastAsia="fr-FR"/>
+        </w:rPr>
       </w:r>
       <w:proofErr w:type="gramEnd"/>
       <w:r>
@@ -1876,57 +1810,51 @@
           <w:szCs w:val="20"/>
           <w:lang w:eastAsia="fr-FR"/>
         </w:rPr>
-        <w:t xml:space="preserve"> le siège d’une lésion serrée (</w:t>
-      </w:r>
-      <w:r>
-        <w:rPr>
-          <w:rFonts w:eastAsia="Times New Roman" w:cs="Calibri"/>
-          <w:color w:val="000000"/>
-          <w:sz w:val="20"/>
-          <w:szCs w:val="20"/>
-          <w:lang w:eastAsia="fr-FR"/>
-        </w:rPr>
-        <w:t>50</w:t>
-      </w:r>
-      <w:r>
-        <w:rPr>
-          <w:rFonts w:eastAsia="Times New Roman" w:cs="Calibri"/>
-          <w:color w:val="000000"/>
-          <w:sz w:val="20"/>
-          <w:szCs w:val="20"/>
-          <w:lang w:eastAsia="fr-FR"/>
-        </w:rPr>
-        <w:t>-</w:t>
-      </w:r>
-      <w:r>
-        <w:rPr>
-          <w:rFonts w:eastAsia="Times New Roman" w:cs="Calibri"/>
-          <w:color w:val="000000"/>
-          <w:sz w:val="20"/>
-          <w:szCs w:val="20"/>
-          <w:lang w:eastAsia="fr-FR"/>
-        </w:rPr>
-        <w:t>70</w:t>
-      </w:r>
-      <w:r>
-        <w:rPr>
-          <w:rFonts w:eastAsia="Times New Roman" w:cs="Calibri"/>
-          <w:color w:val="000000"/>
-          <w:sz w:val="20"/>
-          <w:szCs w:val="20"/>
-          <w:lang w:eastAsia="fr-FR"/>
-        </w:rPr>
-        <w:t>%) juste après le départ de la première marginale avec un flux coronaire antérograde TIMI II et un  bon lit d’aval.</w:t>
-      </w:r>
-      <w:r>
-        <w:rPr>
-          <w:rFonts w:eastAsia="Times New Roman" w:cs="Calibri"/>
-          <w:color w:val="000000"/>
-          <w:sz w:val="20"/>
-          <w:szCs w:val="20"/>
-          <w:lang w:eastAsia="fr-FR"/>
-        </w:rPr>
-        <w:t xml:space="preserve"> La marginale présente une lésion serrée </w:t>
+      </w:r>
+      <w:r>
+        <w:rPr>
+          <w:rFonts w:eastAsia="Times New Roman" w:cs="Calibri"/>
+          <w:color w:val="000000"/>
+          <w:sz w:val="20"/>
+          <w:szCs w:val="20"/>
+          <w:lang w:eastAsia="fr-FR"/>
+        </w:rPr>
+      </w:r>
+      <w:r>
+        <w:rPr>
+          <w:rFonts w:eastAsia="Times New Roman" w:cs="Calibri"/>
+          <w:color w:val="000000"/>
+          <w:sz w:val="20"/>
+          <w:szCs w:val="20"/>
+          <w:lang w:eastAsia="fr-FR"/>
+        </w:rPr>
+      </w:r>
+      <w:r>
+        <w:rPr>
+          <w:rFonts w:eastAsia="Times New Roman" w:cs="Calibri"/>
+          <w:color w:val="000000"/>
+          <w:sz w:val="20"/>
+          <w:szCs w:val="20"/>
+          <w:lang w:eastAsia="fr-FR"/>
+        </w:rPr>
+      </w:r>
+      <w:r>
+        <w:rPr>
+          <w:rFonts w:eastAsia="Times New Roman" w:cs="Calibri"/>
+          <w:color w:val="000000"/>
+          <w:sz w:val="20"/>
+          <w:szCs w:val="20"/>
+          <w:lang w:eastAsia="fr-FR"/>
+        </w:rPr>
+      </w:r>
+      <w:r>
+        <w:rPr>
+          <w:rFonts w:eastAsia="Times New Roman" w:cs="Calibri"/>
+          <w:color w:val="000000"/>
+          <w:sz w:val="20"/>
+          <w:szCs w:val="20"/>
+          <w:lang w:eastAsia="fr-FR"/>
+        </w:rPr>
       </w:r>
       <w:proofErr w:type="gramStart"/>
       <w:r>
@@ -1937,7 +1865,6 @@
           <w:szCs w:val="20"/>
           <w:lang w:eastAsia="fr-FR"/>
         </w:rPr>
-        <w:t>( 50</w:t>
       </w:r>
       <w:proofErr w:type="gramEnd"/>
       <w:r>
@@ -1948,7 +1875,6 @@
           <w:szCs w:val="20"/>
           <w:lang w:eastAsia="fr-FR"/>
         </w:rPr>
-        <w:t xml:space="preserve">-70 %)  dans sa partie proximale , et une lésion </w:t>
       </w:r>
       <w:proofErr w:type="spellStart"/>
       <w:r>
@@ -1959,7 +1885,6 @@
           <w:szCs w:val="20"/>
           <w:lang w:eastAsia="fr-FR"/>
         </w:rPr>
-        <w:t>subocclusive</w:t>
       </w:r>
       <w:proofErr w:type="spellEnd"/>
       <w:r>
@@ -1970,7 +1895,6 @@
           <w:szCs w:val="20"/>
           <w:lang w:eastAsia="fr-FR"/>
         </w:rPr>
-        <w:t xml:space="preserve">  (90-99% ) juste avant la bifurcation en collatérales . </w:t>
       </w:r>
       <w:proofErr w:type="gramStart"/>
       <w:r>
@@ -1981,7 +1905,6 @@
           <w:szCs w:val="20"/>
           <w:lang w:eastAsia="fr-FR"/>
         </w:rPr>
-        <w:t>le</w:t>
       </w:r>
       <w:proofErr w:type="gramEnd"/>
       <w:r>
@@ -1992,7 +1915,6 @@
           <w:szCs w:val="20"/>
           <w:lang w:eastAsia="fr-FR"/>
         </w:rPr>
-        <w:t xml:space="preserve"> flux coronaire antérograde est TIMI III avec un bon lit d’aval.</w:t>
       </w:r>
     </w:p>
     <w:p>
@@ -2038,8 +1960,7 @@
           <w:sz w:val="20"/>
           <w:szCs w:val="20"/>
         </w:rPr>
-        <w:lastRenderedPageBreak/>
-        <w:t>Artère</w:t>
+        <w:t>{{CORO_ACD}}</w:t>
       </w:r>
       <w:r>
         <w:rPr>
@@ -2047,7 +1968,6 @@
           <w:sz w:val="20"/>
           <w:szCs w:val="20"/>
         </w:rPr>
-        <w:t xml:space="preserve"> </w:t>
       </w:r>
       <w:r>
         <w:rPr>
@@ -2056,7 +1976,6 @@
           <w:sz w:val="20"/>
           <w:szCs w:val="20"/>
         </w:rPr>
-        <w:t>Coronaire Droite</w:t>
       </w:r>
       <w:r>
         <w:rPr>
@@ -2064,7 +1983,6 @@
           <w:sz w:val="20"/>
           <w:szCs w:val="20"/>
         </w:rPr>
-        <w:t xml:space="preserve">: </w:t>
       </w:r>
       <w:r>
         <w:rPr>
@@ -2072,47 +1990,42 @@
           <w:sz w:val="20"/>
           <w:szCs w:val="20"/>
         </w:rPr>
-        <w:br/>
-      </w:r>
-      <w:r>
-        <w:rPr>
-          <w:rFonts w:eastAsia="Times New Roman" w:cs="Calibri"/>
-          <w:color w:val="000000"/>
-          <w:sz w:val="20"/>
-          <w:szCs w:val="20"/>
-          <w:lang w:eastAsia="fr-FR"/>
-        </w:rPr>
-        <w:t xml:space="preserve">    L'artère coronaire droite se connecte au sinus antéro-droit, de calibre normal, </w:t>
-      </w:r>
-      <w:r>
-        <w:rPr>
-          <w:rFonts w:eastAsia="Times New Roman" w:cs="Calibri"/>
-          <w:color w:val="000000"/>
-          <w:sz w:val="20"/>
-          <w:szCs w:val="20"/>
-          <w:lang w:eastAsia="fr-FR"/>
-        </w:rPr>
-        <w:t xml:space="preserve">infiltrée sur toute sa longueur .Elle est </w:t>
-      </w:r>
-      <w:r>
-        <w:rPr>
-          <w:rFonts w:eastAsia="Times New Roman" w:cs="Calibri"/>
-          <w:color w:val="000000"/>
-          <w:sz w:val="20"/>
-          <w:szCs w:val="20"/>
-          <w:lang w:eastAsia="fr-FR"/>
-        </w:rPr>
-        <w:t xml:space="preserve">siège </w:t>
-      </w:r>
-      <w:r>
-        <w:rPr>
-          <w:rFonts w:eastAsia="Times New Roman" w:cs="Calibri"/>
-          <w:color w:val="000000"/>
-          <w:sz w:val="20"/>
-          <w:szCs w:val="20"/>
-          <w:lang w:eastAsia="fr-FR"/>
-        </w:rPr>
-        <w:t xml:space="preserve">d’une plaque </w:t>
+      </w:r>
+      <w:r>
+        <w:rPr>
+          <w:rFonts w:eastAsia="Times New Roman" w:cs="Calibri"/>
+          <w:color w:val="000000"/>
+          <w:sz w:val="20"/>
+          <w:szCs w:val="20"/>
+          <w:lang w:eastAsia="fr-FR"/>
+        </w:rPr>
+      </w:r>
+      <w:r>
+        <w:rPr>
+          <w:rFonts w:eastAsia="Times New Roman" w:cs="Calibri"/>
+          <w:color w:val="000000"/>
+          <w:sz w:val="20"/>
+          <w:szCs w:val="20"/>
+          <w:lang w:eastAsia="fr-FR"/>
+        </w:rPr>
+      </w:r>
+      <w:r>
+        <w:rPr>
+          <w:rFonts w:eastAsia="Times New Roman" w:cs="Calibri"/>
+          <w:color w:val="000000"/>
+          <w:sz w:val="20"/>
+          <w:szCs w:val="20"/>
+          <w:lang w:eastAsia="fr-FR"/>
+        </w:rPr>
+      </w:r>
+      <w:r>
+        <w:rPr>
+          <w:rFonts w:eastAsia="Times New Roman" w:cs="Calibri"/>
+          <w:color w:val="000000"/>
+          <w:sz w:val="20"/>
+          <w:szCs w:val="20"/>
+          <w:lang w:eastAsia="fr-FR"/>
+        </w:rPr>
       </w:r>
       <w:proofErr w:type="spellStart"/>
       <w:r>
@@ -2123,7 +2036,6 @@
           <w:szCs w:val="20"/>
           <w:lang w:eastAsia="fr-FR"/>
         </w:rPr>
-        <w:t>intermediaire</w:t>
       </w:r>
       <w:proofErr w:type="spellEnd"/>
       <w:r>
@@ -2134,27 +2046,24 @@
           <w:szCs w:val="20"/>
           <w:lang w:eastAsia="fr-FR"/>
         </w:rPr>
-        <w:t xml:space="preserve"> de 50% à son ostium , suivie d’une lésion très serrée ( 70-90% ) au niveau de son genou supérieur , </w:t>
-      </w:r>
-      <w:r>
-        <w:rPr>
-          <w:rFonts w:eastAsia="Times New Roman" w:cs="Calibri"/>
-          <w:color w:val="000000"/>
-          <w:sz w:val="20"/>
-          <w:szCs w:val="20"/>
-          <w:lang w:eastAsia="fr-FR"/>
-        </w:rPr>
-        <w:t> </w:t>
-      </w:r>
-      <w:r>
-        <w:rPr>
-          <w:rFonts w:eastAsia="Times New Roman" w:cs="Calibri"/>
-          <w:color w:val="000000"/>
-          <w:sz w:val="20"/>
-          <w:szCs w:val="20"/>
-          <w:lang w:eastAsia="fr-FR"/>
-        </w:rPr>
-        <w:t xml:space="preserve">d’une lésion serrée de la CD2 (50-70 %)  au niveau de son genou inferieur . </w:t>
+      </w:r>
+      <w:r>
+        <w:rPr>
+          <w:rFonts w:eastAsia="Times New Roman" w:cs="Calibri"/>
+          <w:color w:val="000000"/>
+          <w:sz w:val="20"/>
+          <w:szCs w:val="20"/>
+          <w:lang w:eastAsia="fr-FR"/>
+        </w:rPr>
+      </w:r>
+      <w:r>
+        <w:rPr>
+          <w:rFonts w:eastAsia="Times New Roman" w:cs="Calibri"/>
+          <w:color w:val="000000"/>
+          <w:sz w:val="20"/>
+          <w:szCs w:val="20"/>
+          <w:lang w:eastAsia="fr-FR"/>
+        </w:rPr>
       </w:r>
       <w:proofErr w:type="gramStart"/>
       <w:r>
@@ -2165,7 +2074,6 @@
           <w:szCs w:val="20"/>
           <w:lang w:eastAsia="fr-FR"/>
         </w:rPr>
-        <w:t>l’artère</w:t>
       </w:r>
       <w:proofErr w:type="gramEnd"/>
       <w:r>
@@ -2176,7 +2084,6 @@
           <w:szCs w:val="20"/>
           <w:lang w:eastAsia="fr-FR"/>
         </w:rPr>
-        <w:t xml:space="preserve"> IVP présente à sa proximité une lésion </w:t>
       </w:r>
       <w:proofErr w:type="spellStart"/>
       <w:r>
@@ -2187,7 +2094,6 @@
           <w:szCs w:val="20"/>
           <w:lang w:eastAsia="fr-FR"/>
         </w:rPr>
-        <w:t>subocclusive</w:t>
       </w:r>
       <w:proofErr w:type="spellEnd"/>
       <w:r>
@@ -2198,7 +2104,6 @@
           <w:szCs w:val="20"/>
           <w:lang w:eastAsia="fr-FR"/>
         </w:rPr>
-        <w:t xml:space="preserve"> ( 90-99% ) avec flux coronaire antérograde TIMI III et un bon lit d’aval , l’artère RVP présente à sa proximité une lésion très serrée ( 70-90% ) avec un flux coronaire antérograde TIMI III et un bon lit d’aval .</w:t>
       </w:r>
     </w:p>
     <w:p>
@@ -2307,7 +2212,6 @@
           <w:sz w:val="20"/>
           <w:szCs w:val="20"/>
         </w:rPr>
-        <w:t xml:space="preserve">Coro : </w:t>
       </w:r>
     </w:p>
     <w:p>
@@ -2326,7 +2230,7 @@
           <w:sz w:val="20"/>
           <w:szCs w:val="20"/>
         </w:rPr>
-        <w:t xml:space="preserve">Lésions tritronculaires.  </w:t>
+        <w:t>{{CONCLUSION}}</w:t>
       </w:r>
     </w:p>
     <w:p>
@@ -2346,7 +2250,7 @@
           <w:sz w:val="20"/>
           <w:szCs w:val="20"/>
         </w:rPr>
-        <w:t xml:space="preserve">Lésion </w:t>
+        <w:t>{{CONCLUSION}}</w:t>
       </w:r>
       <w:proofErr w:type="gramStart"/>
       <w:r>
@@ -2354,14 +2258,12 @@
           <w:sz w:val="20"/>
           <w:szCs w:val="20"/>
         </w:rPr>
-        <w:t xml:space="preserve">serrée </w:t>
-      </w:r>
-      <w:r>
-        <w:rPr>
-          <w:sz w:val="20"/>
-          <w:szCs w:val="20"/>
-        </w:rPr>
-        <w:t xml:space="preserve"> du</w:t>
+      </w:r>
+      <w:r>
+        <w:rPr>
+          <w:sz w:val="20"/>
+          <w:szCs w:val="20"/>
+        </w:rPr>
       </w:r>
       <w:proofErr w:type="gramEnd"/>
       <w:r>
@@ -2369,14 +2271,12 @@
           <w:sz w:val="20"/>
           <w:szCs w:val="20"/>
         </w:rPr>
-        <w:t xml:space="preserve"> </w:t>
-      </w:r>
-      <w:r>
-        <w:rPr>
-          <w:sz w:val="20"/>
-          <w:szCs w:val="20"/>
-        </w:rPr>
-        <w:t>TCG ( 50 – 70 % ) .</w:t>
+      </w:r>
+      <w:r>
+        <w:rPr>
+          <w:sz w:val="20"/>
+          <w:szCs w:val="20"/>
+        </w:rPr>
       </w:r>
     </w:p>
     <w:p>
@@ -2396,7 +2296,7 @@
           <w:sz w:val="20"/>
           <w:szCs w:val="20"/>
         </w:rPr>
-        <w:t>Lésion serrée de l’IVA proximo-moyenne (50-70</w:t>
+        <w:t>{{CONCLUSION}}</w:t>
       </w:r>
       <w:proofErr w:type="gramStart"/>
       <w:r>
@@ -2404,7 +2304,6 @@
           <w:sz w:val="20"/>
           <w:szCs w:val="20"/>
         </w:rPr>
-        <w:t>%) ,</w:t>
       </w:r>
       <w:proofErr w:type="gramEnd"/>
       <w:r>
@@ -2412,7 +2311,6 @@
           <w:sz w:val="20"/>
           <w:szCs w:val="20"/>
         </w:rPr>
-        <w:t xml:space="preserve"> Lésion serrée de l’IVA distale ( 70% ) avec un flux coronaire antérograde TIMI III et un bon lit d’aval .</w:t>
       </w:r>
     </w:p>
     <w:p>
@@ -2432,7 +2330,7 @@
           <w:sz w:val="20"/>
           <w:szCs w:val="20"/>
         </w:rPr>
-        <w:t xml:space="preserve">Lésion serrée de la Cx distale </w:t>
+        <w:t>{{CONCLUSION}}</w:t>
       </w:r>
       <w:proofErr w:type="gramStart"/>
       <w:r>
@@ -2440,7 +2338,6 @@
           <w:sz w:val="20"/>
           <w:szCs w:val="20"/>
         </w:rPr>
-        <w:t>( 50</w:t>
       </w:r>
       <w:proofErr w:type="gramEnd"/>
       <w:r>
@@ -2448,7 +2345,6 @@
           <w:sz w:val="20"/>
           <w:szCs w:val="20"/>
         </w:rPr>
-        <w:t>-70 % ) avec un flux coronaire antérograde TIMI III .</w:t>
       </w:r>
     </w:p>
     <w:p>
@@ -2468,7 +2364,7 @@
           <w:sz w:val="20"/>
           <w:szCs w:val="20"/>
         </w:rPr>
-        <w:t xml:space="preserve">Lésion serrée </w:t>
+        <w:t>{{CONCLUSION}}</w:t>
       </w:r>
       <w:proofErr w:type="gramStart"/>
       <w:r>
@@ -2476,7 +2372,6 @@
           <w:sz w:val="20"/>
           <w:szCs w:val="20"/>
         </w:rPr>
-        <w:t>( 50</w:t>
       </w:r>
       <w:proofErr w:type="gramEnd"/>
       <w:r>
@@ -2484,7 +2379,6 @@
           <w:sz w:val="20"/>
           <w:szCs w:val="20"/>
         </w:rPr>
-        <w:t xml:space="preserve">-70 % ) de la partie proximale de la marginale et une lésion </w:t>
       </w:r>
       <w:proofErr w:type="spellStart"/>
       <w:r>
@@ -2492,7 +2386,6 @@
           <w:sz w:val="20"/>
           <w:szCs w:val="20"/>
         </w:rPr>
-        <w:t>subocclusive</w:t>
       </w:r>
       <w:proofErr w:type="spellEnd"/>
       <w:r>
@@ -2500,7 +2393,6 @@
           <w:sz w:val="20"/>
           <w:szCs w:val="20"/>
         </w:rPr>
-        <w:t xml:space="preserve"> (90-99% ) avant la  bifurcation en deux collatérales avec un flux coronaire antérograde TIMI III et un bon lit d’aval .</w:t>
       </w:r>
     </w:p>
     <w:p>
@@ -2522,7 +2414,7 @@
           <w:sz w:val="20"/>
           <w:szCs w:val="20"/>
         </w:rPr>
-        <w:t xml:space="preserve">Lésion très serrée </w:t>
+        <w:t>{{CONCLUSION}}</w:t>
       </w:r>
       <w:proofErr w:type="gramStart"/>
       <w:r>
@@ -2530,7 +2422,6 @@
           <w:sz w:val="20"/>
           <w:szCs w:val="20"/>
         </w:rPr>
-        <w:t>( 70</w:t>
       </w:r>
       <w:proofErr w:type="gramEnd"/>
       <w:r>
@@ -2538,7 +2429,6 @@
           <w:sz w:val="20"/>
           <w:szCs w:val="20"/>
         </w:rPr>
-        <w:t xml:space="preserve">-90% ) du </w:t>
       </w:r>
       <w:proofErr w:type="spellStart"/>
       <w:r>
@@ -2546,7 +2436,6 @@
           <w:sz w:val="20"/>
           <w:szCs w:val="20"/>
         </w:rPr>
-        <w:t>génou</w:t>
       </w:r>
       <w:proofErr w:type="spellEnd"/>
       <w:r>
@@ -2554,7 +2443,6 @@
           <w:sz w:val="20"/>
           <w:szCs w:val="20"/>
         </w:rPr>
-        <w:t xml:space="preserve"> </w:t>
       </w:r>
       <w:proofErr w:type="spellStart"/>
       <w:r>
@@ -2562,7 +2450,6 @@
           <w:sz w:val="20"/>
           <w:szCs w:val="20"/>
         </w:rPr>
-        <w:t>superieur</w:t>
       </w:r>
       <w:proofErr w:type="spellEnd"/>
       <w:r>
@@ -2570,7 +2457,6 @@
           <w:sz w:val="20"/>
           <w:szCs w:val="20"/>
         </w:rPr>
-        <w:t xml:space="preserve"> de la CD , lésion serrée ( 50-70% ) de la CD2 avec un flux coronaire antérograde TIMI III et un bon lit d’aval.</w:t>
       </w:r>
     </w:p>
     <w:p>
@@ -2592,7 +2478,7 @@
           <w:sz w:val="20"/>
           <w:szCs w:val="20"/>
         </w:rPr>
-        <w:t xml:space="preserve">Lésion </w:t>
+        <w:t>{{CONCLUSION}}</w:t>
       </w:r>
       <w:proofErr w:type="spellStart"/>
       <w:r>
@@ -2600,7 +2486,6 @@
           <w:sz w:val="20"/>
           <w:szCs w:val="20"/>
         </w:rPr>
-        <w:t>subocclusive</w:t>
       </w:r>
       <w:proofErr w:type="spellEnd"/>
       <w:r>
@@ -2608,7 +2493,6 @@
           <w:sz w:val="20"/>
           <w:szCs w:val="20"/>
         </w:rPr>
-        <w:t xml:space="preserve"> de la partie proximale de </w:t>
       </w:r>
       <w:proofErr w:type="gramStart"/>
       <w:r>
@@ -2616,7 +2500,6 @@
           <w:sz w:val="20"/>
           <w:szCs w:val="20"/>
         </w:rPr>
-        <w:t>l’IVP ,</w:t>
       </w:r>
       <w:proofErr w:type="gramEnd"/>
       <w:r>
@@ -2624,7 +2507,6 @@
           <w:sz w:val="20"/>
           <w:szCs w:val="20"/>
         </w:rPr>
-        <w:t xml:space="preserve"> avec un flux coronaire antérograde TIMI III et un bon lit d’aval.</w:t>
       </w:r>
     </w:p>
     <w:p>
@@ -2646,7 +2528,7 @@
           <w:sz w:val="20"/>
           <w:szCs w:val="20"/>
         </w:rPr>
-        <w:t>Lésion très serrée de la partie proximale de l’artère RVP avec un flux coronaire antérograde TIMI III et un bon lit d’aval.</w:t>
+        <w:t>{{CONCLUSION}}</w:t>
       </w:r>
     </w:p>
     <w:p>
@@ -2666,7 +2548,7 @@
           <w:sz w:val="20"/>
           <w:szCs w:val="20"/>
         </w:rPr>
-        <w:t xml:space="preserve">Décision : Revascularisation </w:t>
+        <w:t>Décision : {{DECISION}}</w:t>
       </w:r>
       <w:proofErr w:type="gramStart"/>
       <w:r>
@@ -2676,7 +2558,6 @@
           <w:sz w:val="20"/>
           <w:szCs w:val="20"/>
         </w:rPr>
-        <w:t>chirurgicale .</w:t>
       </w:r>
       <w:proofErr w:type="gramEnd"/>
       <w:r>
@@ -2686,7 +2567,6 @@
           <w:sz w:val="20"/>
           <w:szCs w:val="20"/>
         </w:rPr>
-        <w:t xml:space="preserve"> </w:t>
       </w:r>
     </w:p>
     <w:p>
@@ -2707,7 +2587,7 @@
           <w:b/>
           <w:bCs/>
         </w:rPr>
-        <w:t>Dr NAJLAA BELHARTY, Dr HAJJAJ BELGHAIT, Dr EL MEHDI EL HADDIOUI, Dr IDRISS ALLALAT, Dr MEHDI AYOUB LAAROUSSI</w:t>
+        <w:t>{{OPERATORS}}</w:t>
       </w:r>
     </w:p>
     <w:p>

</xml_diff>